<commit_message>
docs: corregir estrategia de ramas
</commit_message>
<xml_diff>
--- a/Documentacion/Planificacion/Planes/PLAN DE GESTIÓN DE LOS REQUISITOS.docx
+++ b/Documentacion/Planificacion/Planes/PLAN DE GESTIÓN DE LOS REQUISITOS.docx
@@ -4,7 +4,7 @@
   <w:body>
     <w:tbl>
       <w:tblPr>
-        <w:tblStyle w:val="TableGrid"/>
+        <w:tblStyle w:val="Tablaconcuadrcula"/>
         <w:tblW w:w="10627" w:type="dxa"/>
         <w:tblLayout w:type="fixed"/>
         <w:tblLook w:val="04A0" w:firstRow="1" w:lastRow="0" w:firstColumn="1" w:lastColumn="0" w:noHBand="0" w:noVBand="1"/>
@@ -195,7 +195,7 @@
     </w:p>
     <w:tbl>
       <w:tblPr>
-        <w:tblStyle w:val="TableGrid"/>
+        <w:tblStyle w:val="Tablaconcuadrcula"/>
         <w:tblW w:w="10627" w:type="dxa"/>
         <w:tblLayout w:type="fixed"/>
         <w:tblLook w:val="04A0" w:firstRow="1" w:lastRow="0" w:firstColumn="1" w:lastColumn="0" w:noHBand="0" w:noVBand="1"/>
@@ -343,7 +343,7 @@
           </w:p>
           <w:p>
             <w:pPr>
-              <w:pStyle w:val="ListParagraph"/>
+              <w:pStyle w:val="Prrafodelista"/>
               <w:numPr>
                 <w:ilvl w:val="0"/>
                 <w:numId w:val="23"/>
@@ -413,7 +413,7 @@
           </w:p>
           <w:p>
             <w:pPr>
-              <w:pStyle w:val="ListParagraph"/>
+              <w:pStyle w:val="Prrafodelista"/>
               <w:numPr>
                 <w:ilvl w:val="0"/>
                 <w:numId w:val="18"/>
@@ -441,7 +441,7 @@
           </w:p>
           <w:p>
             <w:pPr>
-              <w:pStyle w:val="ListParagraph"/>
+              <w:pStyle w:val="Prrafodelista"/>
               <w:tabs>
                 <w:tab w:val="left" w:pos="0"/>
               </w:tabs>
@@ -470,7 +470,7 @@
     </w:p>
     <w:tbl>
       <w:tblPr>
-        <w:tblStyle w:val="TableGrid"/>
+        <w:tblStyle w:val="Tablaconcuadrcula"/>
         <w:tblW w:w="10627" w:type="dxa"/>
         <w:tblLayout w:type="fixed"/>
         <w:tblLook w:val="04A0" w:firstRow="1" w:lastRow="0" w:firstColumn="1" w:lastColumn="0" w:noHBand="0" w:noVBand="1"/>
@@ -640,7 +640,7 @@
     </w:p>
     <w:tbl>
       <w:tblPr>
-        <w:tblStyle w:val="TableGrid"/>
+        <w:tblStyle w:val="Tablaconcuadrcula"/>
         <w:tblW w:w="10627" w:type="dxa"/>
         <w:tblLayout w:type="fixed"/>
         <w:tblLook w:val="04A0" w:firstRow="1" w:lastRow="0" w:firstColumn="1" w:lastColumn="0" w:noHBand="0" w:noVBand="1"/>
@@ -866,7 +866,7 @@
     </w:p>
     <w:tbl>
       <w:tblPr>
-        <w:tblStyle w:val="TableGrid"/>
+        <w:tblStyle w:val="Tablaconcuadrcula"/>
         <w:tblW w:w="10627" w:type="dxa"/>
         <w:tblLayout w:type="fixed"/>
         <w:tblLook w:val="04A0" w:firstRow="1" w:lastRow="0" w:firstColumn="1" w:lastColumn="0" w:noHBand="0" w:noVBand="1"/>
@@ -959,7 +959,7 @@
           </w:p>
           <w:p>
             <w:pPr>
-              <w:pStyle w:val="ListParagraph"/>
+              <w:pStyle w:val="Prrafodelista"/>
               <w:numPr>
                 <w:ilvl w:val="0"/>
                 <w:numId w:val="18"/>
@@ -985,29 +985,7 @@
                 <w:sz w:val="20"/>
                 <w:szCs w:val="20"/>
               </w:rPr>
-              <w:t xml:space="preserve">Must </w:t>
-            </w:r>
-            <w:proofErr w:type="spellStart"/>
-            <w:r>
-              <w:rPr>
-                <w:rFonts w:ascii="Tahoma" w:hAnsi="Tahoma" w:cs="Tahoma"/>
-                <w:b/>
-                <w:bCs/>
-                <w:sz w:val="20"/>
-                <w:szCs w:val="20"/>
-              </w:rPr>
-              <w:t>have</w:t>
-            </w:r>
-            <w:proofErr w:type="spellEnd"/>
-            <w:r>
-              <w:rPr>
-                <w:rFonts w:ascii="Tahoma" w:hAnsi="Tahoma" w:cs="Tahoma"/>
-                <w:b/>
-                <w:bCs/>
-                <w:sz w:val="20"/>
-                <w:szCs w:val="20"/>
-              </w:rPr>
-              <w:t xml:space="preserve">: </w:t>
+              <w:t xml:space="preserve">Must have: </w:t>
             </w:r>
             <w:r>
               <w:rPr>
@@ -1028,7 +1006,7 @@
           </w:p>
           <w:p>
             <w:pPr>
-              <w:pStyle w:val="ListParagraph"/>
+              <w:pStyle w:val="Prrafodelista"/>
               <w:numPr>
                 <w:ilvl w:val="0"/>
                 <w:numId w:val="18"/>
@@ -1046,49 +1024,15 @@
                 <w:szCs w:val="20"/>
               </w:rPr>
             </w:pPr>
-            <w:proofErr w:type="spellStart"/>
-            <w:r>
-              <w:rPr>
-                <w:rFonts w:ascii="Tahoma" w:hAnsi="Tahoma" w:cs="Tahoma"/>
-                <w:b/>
-                <w:bCs/>
-                <w:sz w:val="20"/>
-                <w:szCs w:val="20"/>
-              </w:rPr>
-              <w:t>Should</w:t>
-            </w:r>
-            <w:proofErr w:type="spellEnd"/>
-            <w:r>
-              <w:rPr>
-                <w:rFonts w:ascii="Tahoma" w:hAnsi="Tahoma" w:cs="Tahoma"/>
-                <w:b/>
-                <w:bCs/>
-                <w:sz w:val="20"/>
-                <w:szCs w:val="20"/>
-              </w:rPr>
-              <w:t xml:space="preserve"> </w:t>
-            </w:r>
-            <w:proofErr w:type="spellStart"/>
-            <w:r>
-              <w:rPr>
-                <w:rFonts w:ascii="Tahoma" w:hAnsi="Tahoma" w:cs="Tahoma"/>
-                <w:b/>
-                <w:bCs/>
-                <w:sz w:val="20"/>
-                <w:szCs w:val="20"/>
-              </w:rPr>
-              <w:t>have</w:t>
-            </w:r>
-            <w:proofErr w:type="spellEnd"/>
-            <w:r>
-              <w:rPr>
-                <w:rFonts w:ascii="Tahoma" w:hAnsi="Tahoma" w:cs="Tahoma"/>
-                <w:b/>
-                <w:bCs/>
-                <w:sz w:val="20"/>
-                <w:szCs w:val="20"/>
-              </w:rPr>
-              <w:t xml:space="preserve">: </w:t>
+            <w:r>
+              <w:rPr>
+                <w:rFonts w:ascii="Tahoma" w:hAnsi="Tahoma" w:cs="Tahoma"/>
+                <w:b/>
+                <w:bCs/>
+                <w:sz w:val="20"/>
+                <w:szCs w:val="20"/>
+              </w:rPr>
+              <w:t xml:space="preserve">Should have: </w:t>
             </w:r>
             <w:r>
               <w:rPr>
@@ -1111,7 +1055,7 @@
           </w:p>
           <w:p>
             <w:pPr>
-              <w:pStyle w:val="ListParagraph"/>
+              <w:pStyle w:val="Prrafodelista"/>
               <w:numPr>
                 <w:ilvl w:val="0"/>
                 <w:numId w:val="18"/>
@@ -1129,49 +1073,15 @@
                 <w:szCs w:val="20"/>
               </w:rPr>
             </w:pPr>
-            <w:proofErr w:type="spellStart"/>
-            <w:r>
-              <w:rPr>
-                <w:rFonts w:ascii="Tahoma" w:hAnsi="Tahoma" w:cs="Tahoma"/>
-                <w:b/>
-                <w:bCs/>
-                <w:sz w:val="20"/>
-                <w:szCs w:val="20"/>
-              </w:rPr>
-              <w:t>Could</w:t>
-            </w:r>
-            <w:proofErr w:type="spellEnd"/>
-            <w:r>
-              <w:rPr>
-                <w:rFonts w:ascii="Tahoma" w:hAnsi="Tahoma" w:cs="Tahoma"/>
-                <w:b/>
-                <w:bCs/>
-                <w:sz w:val="20"/>
-                <w:szCs w:val="20"/>
-              </w:rPr>
-              <w:t xml:space="preserve"> </w:t>
-            </w:r>
-            <w:proofErr w:type="spellStart"/>
-            <w:r>
-              <w:rPr>
-                <w:rFonts w:ascii="Tahoma" w:hAnsi="Tahoma" w:cs="Tahoma"/>
-                <w:b/>
-                <w:bCs/>
-                <w:sz w:val="20"/>
-                <w:szCs w:val="20"/>
-              </w:rPr>
-              <w:t>have</w:t>
-            </w:r>
-            <w:proofErr w:type="spellEnd"/>
-            <w:r>
-              <w:rPr>
-                <w:rFonts w:ascii="Tahoma" w:hAnsi="Tahoma" w:cs="Tahoma"/>
-                <w:b/>
-                <w:bCs/>
-                <w:sz w:val="20"/>
-                <w:szCs w:val="20"/>
-              </w:rPr>
-              <w:t xml:space="preserve">: </w:t>
+            <w:r>
+              <w:rPr>
+                <w:rFonts w:ascii="Tahoma" w:hAnsi="Tahoma" w:cs="Tahoma"/>
+                <w:b/>
+                <w:bCs/>
+                <w:sz w:val="20"/>
+                <w:szCs w:val="20"/>
+              </w:rPr>
+              <w:t xml:space="preserve">Could have: </w:t>
             </w:r>
             <w:r>
               <w:rPr>
@@ -1194,7 +1104,7 @@
           </w:p>
           <w:p>
             <w:pPr>
-              <w:pStyle w:val="ListParagraph"/>
+              <w:pStyle w:val="Prrafodelista"/>
               <w:numPr>
                 <w:ilvl w:val="0"/>
                 <w:numId w:val="18"/>
@@ -1212,49 +1122,15 @@
                 <w:szCs w:val="20"/>
               </w:rPr>
             </w:pPr>
-            <w:proofErr w:type="spellStart"/>
-            <w:r>
-              <w:rPr>
-                <w:rFonts w:ascii="Tahoma" w:hAnsi="Tahoma" w:cs="Tahoma"/>
-                <w:b/>
-                <w:bCs/>
-                <w:sz w:val="20"/>
-                <w:szCs w:val="20"/>
-              </w:rPr>
-              <w:t>Won’t</w:t>
-            </w:r>
-            <w:proofErr w:type="spellEnd"/>
-            <w:r>
-              <w:rPr>
-                <w:rFonts w:ascii="Tahoma" w:hAnsi="Tahoma" w:cs="Tahoma"/>
-                <w:b/>
-                <w:bCs/>
-                <w:sz w:val="20"/>
-                <w:szCs w:val="20"/>
-              </w:rPr>
-              <w:t xml:space="preserve"> </w:t>
-            </w:r>
-            <w:proofErr w:type="spellStart"/>
-            <w:r>
-              <w:rPr>
-                <w:rFonts w:ascii="Tahoma" w:hAnsi="Tahoma" w:cs="Tahoma"/>
-                <w:b/>
-                <w:bCs/>
-                <w:sz w:val="20"/>
-                <w:szCs w:val="20"/>
-              </w:rPr>
-              <w:t>have</w:t>
-            </w:r>
-            <w:proofErr w:type="spellEnd"/>
-            <w:r>
-              <w:rPr>
-                <w:rFonts w:ascii="Tahoma" w:hAnsi="Tahoma" w:cs="Tahoma"/>
-                <w:b/>
-                <w:bCs/>
-                <w:sz w:val="20"/>
-                <w:szCs w:val="20"/>
-              </w:rPr>
-              <w:t xml:space="preserve">: </w:t>
+            <w:r>
+              <w:rPr>
+                <w:rFonts w:ascii="Tahoma" w:hAnsi="Tahoma" w:cs="Tahoma"/>
+                <w:b/>
+                <w:bCs/>
+                <w:sz w:val="20"/>
+                <w:szCs w:val="20"/>
+              </w:rPr>
+              <w:t xml:space="preserve">Won’t have: </w:t>
             </w:r>
             <w:r>
               <w:rPr>
@@ -1305,12 +1181,13 @@
                 <w:sz w:val="20"/>
                 <w:szCs w:val="20"/>
               </w:rPr>
+              <w:lastRenderedPageBreak/>
               <w:t>Participantes en el proceso de priorización:</w:t>
             </w:r>
           </w:p>
           <w:p>
             <w:pPr>
-              <w:pStyle w:val="ListParagraph"/>
+              <w:pStyle w:val="Prrafodelista"/>
               <w:numPr>
                 <w:ilvl w:val="0"/>
                 <w:numId w:val="11"/>
@@ -1544,7 +1421,7 @@
     </w:p>
     <w:tbl>
       <w:tblPr>
-        <w:tblStyle w:val="TableGrid"/>
+        <w:tblStyle w:val="Tablaconcuadrcula"/>
         <w:tblW w:w="10627" w:type="dxa"/>
         <w:tblLayout w:type="fixed"/>
         <w:tblLook w:val="04A0" w:firstRow="1" w:lastRow="0" w:firstColumn="1" w:lastColumn="0" w:noHBand="0" w:noVBand="1"/>
@@ -2461,7 +2338,7 @@
     </w:p>
     <w:tbl>
       <w:tblPr>
-        <w:tblStyle w:val="TableGrid"/>
+        <w:tblStyle w:val="Tablaconcuadrcula"/>
         <w:tblW w:w="10627" w:type="dxa"/>
         <w:tblLayout w:type="fixed"/>
         <w:tblLook w:val="04A0" w:firstRow="1" w:lastRow="0" w:firstColumn="1" w:lastColumn="0" w:noHBand="0" w:noVBand="1"/>
@@ -2494,6 +2371,7 @@
                 <w:sz w:val="20"/>
                 <w:szCs w:val="20"/>
               </w:rPr>
+              <w:lastRenderedPageBreak/>
               <w:t>VALIDACIÓN DE REQUISITOS</w:t>
             </w:r>
           </w:p>
@@ -2532,7 +2410,7 @@
           </w:p>
           <w:p>
             <w:pPr>
-              <w:pStyle w:val="ListParagraph"/>
+              <w:pStyle w:val="Prrafodelista"/>
               <w:numPr>
                 <w:ilvl w:val="0"/>
                 <w:numId w:val="11"/>
@@ -2575,7 +2453,7 @@
           </w:p>
           <w:p>
             <w:pPr>
-              <w:pStyle w:val="ListParagraph"/>
+              <w:pStyle w:val="Prrafodelista"/>
               <w:numPr>
                 <w:ilvl w:val="0"/>
                 <w:numId w:val="11"/>
@@ -2644,7 +2522,7 @@
           </w:p>
           <w:p>
             <w:pPr>
-              <w:pStyle w:val="ListParagraph"/>
+              <w:pStyle w:val="Prrafodelista"/>
               <w:numPr>
                 <w:ilvl w:val="0"/>
                 <w:numId w:val="11"/>
@@ -2676,7 +2554,7 @@
           </w:p>
           <w:p>
             <w:pPr>
-              <w:pStyle w:val="ListParagraph"/>
+              <w:pStyle w:val="Prrafodelista"/>
               <w:numPr>
                 <w:ilvl w:val="0"/>
                 <w:numId w:val="11"/>
@@ -2758,19 +2636,8 @@
                 <w:szCs w:val="20"/>
                 <w:lang w:val="es-ES"/>
               </w:rPr>
-              <w:t xml:space="preserve">Validación continua en cada Sprint </w:t>
-            </w:r>
-            <w:proofErr w:type="spellStart"/>
-            <w:r>
-              <w:rPr>
-                <w:rFonts w:ascii="Tahoma" w:hAnsi="Tahoma" w:cs="Tahoma"/>
-                <w:sz w:val="20"/>
-                <w:szCs w:val="20"/>
-                <w:lang w:val="es-ES"/>
-              </w:rPr>
-              <w:t>Review</w:t>
-            </w:r>
-            <w:proofErr w:type="spellEnd"/>
+              <w:t>Validación continua en cada Sprint Review</w:t>
+            </w:r>
           </w:p>
           <w:p>
             <w:pPr>
@@ -2813,7 +2680,7 @@
     </w:p>
     <w:tbl>
       <w:tblPr>
-        <w:tblStyle w:val="TableGrid"/>
+        <w:tblStyle w:val="Tablaconcuadrcula"/>
         <w:tblW w:w="10627" w:type="dxa"/>
         <w:tblLayout w:type="fixed"/>
         <w:tblLook w:val="04A0" w:firstRow="1" w:lastRow="0" w:firstColumn="1" w:lastColumn="0" w:noHBand="0" w:noVBand="1"/>
@@ -2906,7 +2773,7 @@
           </w:p>
           <w:p>
             <w:pPr>
-              <w:pStyle w:val="ListParagraph"/>
+              <w:pStyle w:val="Prrafodelista"/>
               <w:numPr>
                 <w:ilvl w:val="0"/>
                 <w:numId w:val="16"/>
@@ -2915,7 +2782,7 @@
               <w:spacing w:after="26" w:afterAutospacing="1" w:line="240" w:lineRule="auto"/>
               <w:jc w:val="both"/>
               <w:rPr>
-                <w:rStyle w:val="Strong"/>
+                <w:rStyle w:val="Fuerte"/>
                 <w:rFonts w:ascii="Tahoma" w:hAnsi="Tahoma" w:cs="Tahoma"/>
                 <w:sz w:val="20"/>
                 <w:szCs w:val="20"/>
@@ -2924,7 +2791,7 @@
             </w:pPr>
             <w:r>
               <w:rPr>
-                <w:rStyle w:val="Strong"/>
+                <w:rStyle w:val="Fuerte"/>
                 <w:rFonts w:ascii="Tahoma" w:hAnsi="Tahoma" w:cs="Tahoma"/>
                 <w:sz w:val="20"/>
                 <w:szCs w:val="20"/>
@@ -2935,7 +2802,7 @@
           </w:p>
           <w:p>
             <w:pPr>
-              <w:pStyle w:val="ListParagraph"/>
+              <w:pStyle w:val="Prrafodelista"/>
               <w:numPr>
                 <w:ilvl w:val="0"/>
                 <w:numId w:val="16"/>
@@ -2944,7 +2811,7 @@
               <w:spacing w:after="26" w:afterAutospacing="1" w:line="240" w:lineRule="auto"/>
               <w:jc w:val="both"/>
               <w:rPr>
-                <w:rStyle w:val="Strong"/>
+                <w:rStyle w:val="Fuerte"/>
                 <w:rFonts w:ascii="Tahoma" w:hAnsi="Tahoma" w:cs="Tahoma"/>
                 <w:sz w:val="20"/>
                 <w:szCs w:val="20"/>
@@ -2953,7 +2820,7 @@
             </w:pPr>
             <w:r>
               <w:rPr>
-                <w:rStyle w:val="Strong"/>
+                <w:rStyle w:val="Fuerte"/>
                 <w:rFonts w:ascii="Tahoma" w:hAnsi="Tahoma" w:cs="Tahoma"/>
                 <w:sz w:val="20"/>
                 <w:szCs w:val="20"/>
@@ -2967,15 +2834,15 @@
               <w:spacing w:afterAutospacing="0" w:line="240" w:lineRule="auto"/>
               <w:jc w:val="both"/>
               <w:rPr>
-                <w:rStyle w:val="Strong"/>
-                <w:rFonts w:ascii="Tahoma" w:hAnsi="Tahoma" w:cs="Tahoma"/>
-                <w:sz w:val="20"/>
-                <w:szCs w:val="20"/>
-              </w:rPr>
-            </w:pPr>
-            <w:r>
-              <w:rPr>
-                <w:rStyle w:val="Strong"/>
+                <w:rStyle w:val="Fuerte"/>
+                <w:rFonts w:ascii="Tahoma" w:hAnsi="Tahoma" w:cs="Tahoma"/>
+                <w:sz w:val="20"/>
+                <w:szCs w:val="20"/>
+              </w:rPr>
+            </w:pPr>
+            <w:r>
+              <w:rPr>
+                <w:rStyle w:val="Fuerte"/>
                 <w:rFonts w:ascii="Tahoma" w:hAnsi="Tahoma" w:cs="Tahoma"/>
                 <w:sz w:val="20"/>
                 <w:szCs w:val="20"/>
@@ -2985,7 +2852,7 @@
           </w:p>
           <w:p>
             <w:pPr>
-              <w:pStyle w:val="ListParagraph"/>
+              <w:pStyle w:val="Prrafodelista"/>
               <w:numPr>
                 <w:ilvl w:val="0"/>
                 <w:numId w:val="16"/>
@@ -2994,7 +2861,7 @@
               <w:spacing w:after="26" w:afterAutospacing="1" w:line="240" w:lineRule="auto"/>
               <w:jc w:val="both"/>
               <w:rPr>
-                <w:rStyle w:val="Strong"/>
+                <w:rStyle w:val="Fuerte"/>
                 <w:rFonts w:ascii="Tahoma" w:hAnsi="Tahoma" w:cs="Tahoma"/>
                 <w:b w:val="0"/>
                 <w:bCs w:val="0"/>
@@ -3005,7 +2872,7 @@
             </w:pPr>
             <w:r>
               <w:rPr>
-                <w:rStyle w:val="Strong"/>
+                <w:rStyle w:val="Fuerte"/>
                 <w:rFonts w:ascii="Tahoma" w:hAnsi="Tahoma" w:cs="Tahoma"/>
                 <w:sz w:val="20"/>
                 <w:szCs w:val="20"/>
@@ -3016,7 +2883,7 @@
           </w:p>
           <w:p>
             <w:pPr>
-              <w:pStyle w:val="ListParagraph"/>
+              <w:pStyle w:val="Prrafodelista"/>
               <w:numPr>
                 <w:ilvl w:val="0"/>
                 <w:numId w:val="16"/>
@@ -3025,7 +2892,7 @@
               <w:spacing w:after="26" w:afterAutospacing="1" w:line="240" w:lineRule="auto"/>
               <w:jc w:val="both"/>
               <w:rPr>
-                <w:rStyle w:val="Strong"/>
+                <w:rStyle w:val="Fuerte"/>
                 <w:rFonts w:ascii="Tahoma" w:hAnsi="Tahoma" w:cs="Tahoma"/>
                 <w:b w:val="0"/>
                 <w:bCs w:val="0"/>
@@ -3036,7 +2903,7 @@
             </w:pPr>
             <w:r>
               <w:rPr>
-                <w:rStyle w:val="Strong"/>
+                <w:rStyle w:val="Fuerte"/>
                 <w:rFonts w:ascii="Tahoma" w:hAnsi="Tahoma" w:cs="Tahoma"/>
                 <w:sz w:val="20"/>
                 <w:szCs w:val="20"/>
@@ -3057,7 +2924,7 @@
             </w:pPr>
             <w:r>
               <w:rPr>
-                <w:rStyle w:val="Strong"/>
+                <w:rStyle w:val="Fuerte"/>
                 <w:rFonts w:ascii="Tahoma" w:hAnsi="Tahoma" w:cs="Tahoma"/>
                 <w:sz w:val="20"/>
                 <w:szCs w:val="20"/>
@@ -3086,7 +2953,7 @@
             </w:pPr>
             <w:r>
               <w:rPr>
-                <w:rStyle w:val="Strong"/>
+                <w:rStyle w:val="Fuerte"/>
                 <w:rFonts w:ascii="Tahoma" w:hAnsi="Tahoma" w:cs="Tahoma"/>
                 <w:sz w:val="20"/>
                 <w:szCs w:val="20"/>
@@ -3115,7 +2982,7 @@
             </w:pPr>
             <w:r>
               <w:rPr>
-                <w:rStyle w:val="Strong"/>
+                <w:rStyle w:val="Fuerte"/>
                 <w:rFonts w:ascii="Tahoma" w:hAnsi="Tahoma" w:cs="Tahoma"/>
                 <w:sz w:val="20"/>
                 <w:szCs w:val="20"/>
@@ -3150,7 +3017,7 @@
             </w:pPr>
             <w:r>
               <w:rPr>
-                <w:rStyle w:val="Strong"/>
+                <w:rStyle w:val="Fuerte"/>
                 <w:rFonts w:ascii="Tahoma" w:hAnsi="Tahoma" w:cs="Tahoma"/>
                 <w:sz w:val="20"/>
                 <w:szCs w:val="20"/>
@@ -3182,7 +3049,7 @@
     </w:p>
     <w:tbl>
       <w:tblPr>
-        <w:tblStyle w:val="TableGrid"/>
+        <w:tblStyle w:val="Tablaconcuadrcula"/>
         <w:tblW w:w="10627" w:type="dxa"/>
         <w:tblLayout w:type="fixed"/>
         <w:tblLook w:val="04A0" w:firstRow="1" w:lastRow="0" w:firstColumn="1" w:lastColumn="0" w:noHBand="0" w:noVBand="1"/>
@@ -3202,7 +3069,7 @@
               <w:spacing w:after="0" w:afterAutospacing="0"/>
               <w:jc w:val="both"/>
               <w:rPr>
-                <w:rStyle w:val="Strong"/>
+                <w:rStyle w:val="Fuerte"/>
                 <w:rFonts w:ascii="Tahoma" w:hAnsi="Tahoma" w:cs="Tahoma"/>
                 <w:bCs w:val="0"/>
               </w:rPr>
@@ -3234,7 +3101,7 @@
             </w:pPr>
             <w:r>
               <w:rPr>
-                <w:rStyle w:val="Strong"/>
+                <w:rStyle w:val="Fuerte"/>
                 <w:rFonts w:ascii="Tahoma" w:hAnsi="Tahoma" w:cs="Tahoma"/>
                 <w:sz w:val="20"/>
                 <w:szCs w:val="20"/>
@@ -3263,7 +3130,7 @@
             </w:pPr>
             <w:r>
               <w:rPr>
-                <w:rStyle w:val="Strong"/>
+                <w:rStyle w:val="Fuerte"/>
                 <w:rFonts w:ascii="Tahoma" w:eastAsia="Calibri" w:hAnsi="Tahoma" w:cs="Tahoma"/>
                 <w:sz w:val="20"/>
                 <w:szCs w:val="20"/>
@@ -3300,7 +3167,7 @@
             </w:pPr>
             <w:r>
               <w:rPr>
-                <w:rStyle w:val="Strong"/>
+                <w:rStyle w:val="Fuerte"/>
                 <w:rFonts w:ascii="Tahoma" w:eastAsia="Calibri" w:hAnsi="Tahoma" w:cs="Tahoma"/>
                 <w:sz w:val="20"/>
                 <w:szCs w:val="20"/>
@@ -3339,7 +3206,6 @@
               <w:rPr>
                 <w:rFonts w:ascii="Tahoma" w:eastAsia="Calibri" w:hAnsi="Tahoma" w:cs="Tahoma"/>
                 <w:b/>
-                <w:bCs/>
                 <w:sz w:val="20"/>
                 <w:szCs w:val="20"/>
               </w:rPr>
@@ -3375,7 +3241,7 @@
             </w:pPr>
             <w:r>
               <w:rPr>
-                <w:rStyle w:val="Strong"/>
+                <w:rStyle w:val="Fuerte"/>
                 <w:rFonts w:ascii="Tahoma" w:eastAsia="Calibri" w:hAnsi="Tahoma" w:cs="Tahoma"/>
                 <w:sz w:val="20"/>
                 <w:szCs w:val="20"/>
@@ -3412,7 +3278,7 @@
             </w:pPr>
             <w:r>
               <w:rPr>
-                <w:rStyle w:val="Strong"/>
+                <w:rStyle w:val="Fuerte"/>
                 <w:rFonts w:ascii="Tahoma" w:eastAsia="Calibri" w:hAnsi="Tahoma" w:cs="Tahoma"/>
                 <w:sz w:val="20"/>
                 <w:szCs w:val="20"/>
@@ -3447,7 +3313,7 @@
             </w:pPr>
             <w:r>
               <w:rPr>
-                <w:rStyle w:val="Strong"/>
+                <w:rStyle w:val="Fuerte"/>
                 <w:rFonts w:ascii="Tahoma" w:eastAsia="Calibri" w:hAnsi="Tahoma" w:cs="Tahoma"/>
                 <w:sz w:val="20"/>
                 <w:szCs w:val="20"/>
@@ -3471,7 +3337,7 @@
     </w:p>
     <w:tbl>
       <w:tblPr>
-        <w:tblStyle w:val="TableGrid"/>
+        <w:tblStyle w:val="Tablaconcuadrcula"/>
         <w:tblW w:w="10627" w:type="dxa"/>
         <w:tblLayout w:type="fixed"/>
         <w:tblLook w:val="04A0" w:firstRow="1" w:lastRow="0" w:firstColumn="1" w:lastColumn="0" w:noHBand="0" w:noVBand="1"/>
@@ -3560,7 +3426,7 @@
           </w:p>
           <w:p>
             <w:pPr>
-              <w:pStyle w:val="ListParagraph"/>
+              <w:pStyle w:val="Prrafodelista"/>
               <w:numPr>
                 <w:ilvl w:val="0"/>
                 <w:numId w:val="12"/>
@@ -3577,56 +3443,18 @@
                 <w:szCs w:val="20"/>
               </w:rPr>
             </w:pPr>
-            <w:proofErr w:type="spellStart"/>
-            <w:r>
-              <w:rPr>
-                <w:rFonts w:ascii="Tahoma" w:hAnsi="Tahoma" w:cs="Tahoma"/>
-                <w:sz w:val="20"/>
-                <w:szCs w:val="20"/>
-              </w:rPr>
-              <w:t>main</w:t>
-            </w:r>
-            <w:proofErr w:type="spellEnd"/>
-            <w:r>
-              <w:rPr>
-                <w:rFonts w:ascii="Tahoma" w:hAnsi="Tahoma" w:cs="Tahoma"/>
-                <w:sz w:val="20"/>
-                <w:szCs w:val="20"/>
-              </w:rPr>
-              <w:t xml:space="preserve">(base): Recibe </w:t>
-            </w:r>
-            <w:proofErr w:type="spellStart"/>
-            <w:r>
-              <w:rPr>
-                <w:rFonts w:ascii="Tahoma" w:hAnsi="Tahoma" w:cs="Tahoma"/>
-                <w:sz w:val="20"/>
-                <w:szCs w:val="20"/>
-              </w:rPr>
-              <w:t>releases</w:t>
-            </w:r>
-            <w:proofErr w:type="spellEnd"/>
-            <w:r>
-              <w:rPr>
-                <w:rFonts w:ascii="Tahoma" w:hAnsi="Tahoma" w:cs="Tahoma"/>
-                <w:sz w:val="20"/>
-                <w:szCs w:val="20"/>
-              </w:rPr>
-              <w:t xml:space="preserve"> al final de cada sprint desde </w:t>
-            </w:r>
-            <w:proofErr w:type="spellStart"/>
-            <w:r>
-              <w:rPr>
-                <w:rFonts w:ascii="Tahoma" w:hAnsi="Tahoma" w:cs="Tahoma"/>
-                <w:sz w:val="20"/>
-                <w:szCs w:val="20"/>
-              </w:rPr>
-              <w:t>develop</w:t>
-            </w:r>
-            <w:proofErr w:type="spellEnd"/>
-          </w:p>
-          <w:p>
-            <w:pPr>
-              <w:pStyle w:val="ListParagraph"/>
+            <w:r>
+              <w:rPr>
+                <w:rFonts w:ascii="Tahoma" w:hAnsi="Tahoma" w:cs="Tahoma"/>
+                <w:sz w:val="20"/>
+                <w:szCs w:val="20"/>
+              </w:rPr>
+              <w:t>main(base): Recibe releases al final de cada sprint desde develop</w:t>
+            </w:r>
+          </w:p>
+          <w:p>
+            <w:pPr>
+              <w:pStyle w:val="Prrafodelista"/>
               <w:numPr>
                 <w:ilvl w:val="0"/>
                 <w:numId w:val="12"/>
@@ -3643,46 +3471,102 @@
                 <w:szCs w:val="20"/>
               </w:rPr>
             </w:pPr>
-            <w:proofErr w:type="spellStart"/>
-            <w:r>
-              <w:rPr>
-                <w:rFonts w:ascii="Tahoma" w:hAnsi="Tahoma" w:cs="Tahoma"/>
-                <w:sz w:val="20"/>
-                <w:szCs w:val="20"/>
-              </w:rPr>
-              <w:t>develop</w:t>
-            </w:r>
-            <w:proofErr w:type="spellEnd"/>
-            <w:r>
-              <w:rPr>
-                <w:rFonts w:ascii="Tahoma" w:hAnsi="Tahoma" w:cs="Tahoma"/>
-                <w:sz w:val="20"/>
-                <w:szCs w:val="20"/>
-              </w:rPr>
-              <w:t xml:space="preserve">: Fusiona </w:t>
-            </w:r>
-            <w:proofErr w:type="spellStart"/>
-            <w:r>
-              <w:rPr>
-                <w:rFonts w:ascii="Tahoma" w:hAnsi="Tahoma" w:cs="Tahoma"/>
-                <w:sz w:val="20"/>
-                <w:szCs w:val="20"/>
-              </w:rPr>
-              <w:t>features</w:t>
-            </w:r>
-            <w:proofErr w:type="spellEnd"/>
-            <w:r>
-              <w:rPr>
-                <w:rFonts w:ascii="Tahoma" w:hAnsi="Tahoma" w:cs="Tahoma"/>
-                <w:sz w:val="20"/>
-                <w:szCs w:val="20"/>
-              </w:rPr>
-              <w:t xml:space="preserve"> completadas</w:t>
-            </w:r>
-          </w:p>
-          <w:p>
-            <w:pPr>
-              <w:pStyle w:val="ListParagraph"/>
+            <w:r>
+              <w:rPr>
+                <w:rFonts w:ascii="Tahoma" w:hAnsi="Tahoma" w:cs="Tahoma"/>
+                <w:sz w:val="20"/>
+                <w:szCs w:val="20"/>
+              </w:rPr>
+              <w:lastRenderedPageBreak/>
+              <w:t>develop: Fusiona features completadas</w:t>
+            </w:r>
+          </w:p>
+          <w:p>
+            <w:pPr>
+              <w:pStyle w:val="Prrafodelista"/>
+              <w:numPr>
+                <w:ilvl w:val="0"/>
+                <w:numId w:val="12"/>
+              </w:numPr>
+              <w:tabs>
+                <w:tab w:val="left" w:pos="0"/>
+              </w:tabs>
+              <w:spacing w:afterAutospacing="1" w:line="240" w:lineRule="auto"/>
+              <w:jc w:val="both"/>
+              <w:rPr>
+                <w:rFonts w:ascii="Tahoma" w:hAnsi="Tahoma" w:cs="Tahoma"/>
+                <w:sz w:val="20"/>
+                <w:szCs w:val="20"/>
+              </w:rPr>
+            </w:pPr>
+            <w:r>
+              <w:rPr>
+                <w:rFonts w:ascii="Tahoma" w:hAnsi="Tahoma" w:cs="Tahoma"/>
+                <w:sz w:val="20"/>
+                <w:szCs w:val="20"/>
+              </w:rPr>
+              <w:t>f</w:t>
+            </w:r>
+            <w:r>
+              <w:rPr>
+                <w:rFonts w:ascii="Tahoma" w:hAnsi="Tahoma" w:cs="Tahoma"/>
+                <w:sz w:val="20"/>
+                <w:szCs w:val="20"/>
+              </w:rPr>
+              <w:t>eature/</w:t>
+            </w:r>
+            <w:r>
+              <w:rPr>
+                <w:rFonts w:ascii="Tahoma" w:hAnsi="Tahoma" w:cs="Tahoma"/>
+                <w:sz w:val="20"/>
+                <w:szCs w:val="20"/>
+              </w:rPr>
+              <w:t>&lt;</w:t>
+            </w:r>
+            <w:r>
+              <w:rPr>
+                <w:rFonts w:ascii="Tahoma" w:hAnsi="Tahoma" w:cs="Tahoma"/>
+                <w:sz w:val="20"/>
+                <w:szCs w:val="20"/>
+              </w:rPr>
+              <w:t>cuenta_control</w:t>
+            </w:r>
+            <w:r>
+              <w:rPr>
+                <w:rFonts w:ascii="Tahoma" w:hAnsi="Tahoma" w:cs="Tahoma"/>
+                <w:sz w:val="20"/>
+                <w:szCs w:val="20"/>
+              </w:rPr>
+              <w:t>&gt;</w:t>
+            </w:r>
+            <w:r>
+              <w:rPr>
+                <w:rFonts w:ascii="Tahoma" w:hAnsi="Tahoma" w:cs="Tahoma"/>
+                <w:sz w:val="20"/>
+                <w:szCs w:val="20"/>
+              </w:rPr>
+              <w:t>-&lt;nombre_paquete&gt;</w:t>
+            </w:r>
+            <w:r>
+              <w:rPr>
+                <w:rFonts w:ascii="Tahoma" w:hAnsi="Tahoma" w:cs="Tahoma"/>
+                <w:sz w:val="20"/>
+                <w:szCs w:val="20"/>
+              </w:rPr>
+              <w:t xml:space="preserve">: temporal para cada </w:t>
+            </w:r>
+            <w:r>
+              <w:rPr>
+                <w:rFonts w:ascii="Tahoma" w:hAnsi="Tahoma" w:cs="Tahoma"/>
+                <w:sz w:val="20"/>
+                <w:szCs w:val="20"/>
+              </w:rPr>
+              <w:t>paquete de trabajo</w:t>
+            </w:r>
+          </w:p>
+          <w:p>
+            <w:pPr>
+              <w:pStyle w:val="Prrafodelista"/>
               <w:numPr>
                 <w:ilvl w:val="0"/>
                 <w:numId w:val="12"/>
@@ -3699,45 +3583,6 @@
                 <w:szCs w:val="20"/>
               </w:rPr>
             </w:pPr>
-            <w:proofErr w:type="spellStart"/>
-            <w:r>
-              <w:rPr>
-                <w:rFonts w:ascii="Tahoma" w:hAnsi="Tahoma" w:cs="Tahoma"/>
-                <w:sz w:val="20"/>
-                <w:szCs w:val="20"/>
-              </w:rPr>
-              <w:t>feature</w:t>
-            </w:r>
-            <w:proofErr w:type="spellEnd"/>
-            <w:r>
-              <w:rPr>
-                <w:rFonts w:ascii="Tahoma" w:hAnsi="Tahoma" w:cs="Tahoma"/>
-                <w:sz w:val="20"/>
-                <w:szCs w:val="20"/>
-              </w:rPr>
-              <w:t xml:space="preserve">/RQ-###: temporal para cada requisito específico. </w:t>
-            </w:r>
-          </w:p>
-          <w:p>
-            <w:pPr>
-              <w:pStyle w:val="ListParagraph"/>
-              <w:numPr>
-                <w:ilvl w:val="0"/>
-                <w:numId w:val="12"/>
-              </w:numPr>
-              <w:tabs>
-                <w:tab w:val="left" w:pos="0"/>
-              </w:tabs>
-              <w:suppressAutoHyphens/>
-              <w:spacing w:after="0" w:afterAutospacing="1" w:line="240" w:lineRule="auto"/>
-              <w:jc w:val="both"/>
-              <w:rPr>
-                <w:rFonts w:ascii="Tahoma" w:hAnsi="Tahoma" w:cs="Tahoma"/>
-                <w:sz w:val="20"/>
-                <w:szCs w:val="20"/>
-              </w:rPr>
-            </w:pPr>
-            <w:proofErr w:type="spellStart"/>
             <w:r>
               <w:rPr>
                 <w:rFonts w:ascii="Tahoma" w:hAnsi="Tahoma" w:cs="Tahoma"/>
@@ -3754,7 +3599,6 @@
               </w:rPr>
               <w:t>s</w:t>
             </w:r>
-            <w:proofErr w:type="spellEnd"/>
             <w:r>
               <w:rPr>
                 <w:rFonts w:ascii="Tahoma" w:hAnsi="Tahoma" w:cs="Tahoma"/>
@@ -3792,7 +3636,7 @@
           </w:p>
           <w:p>
             <w:pPr>
-              <w:pStyle w:val="ListParagraph"/>
+              <w:pStyle w:val="Prrafodelista"/>
               <w:numPr>
                 <w:ilvl w:val="0"/>
                 <w:numId w:val="17"/>
@@ -3817,7 +3661,23 @@
                 <w:sz w:val="20"/>
                 <w:szCs w:val="20"/>
               </w:rPr>
-              <w:t>Nuevo requisito</w:t>
+              <w:t xml:space="preserve">Nueva </w:t>
+            </w:r>
+            <w:r>
+              <w:rPr>
+                <w:rFonts w:ascii="Tahoma" w:hAnsi="Tahoma" w:cs="Tahoma"/>
+                <w:sz w:val="20"/>
+                <w:szCs w:val="20"/>
+              </w:rPr>
+              <w:t>paquete de trabajo</w:t>
+            </w:r>
+            <w:r>
+              <w:rPr>
+                <w:rFonts w:ascii="Tahoma" w:hAnsi="Tahoma" w:cs="Tahoma"/>
+                <w:sz w:val="20"/>
+                <w:szCs w:val="20"/>
+              </w:rPr>
+              <w:t xml:space="preserve"> a implementar</w:t>
             </w:r>
             <w:r>
               <w:rPr>
@@ -3835,38 +3695,26 @@
               </w:rPr>
               <w:t xml:space="preserve">Se crea </w:t>
             </w:r>
-            <w:proofErr w:type="spellStart"/>
-            <w:r>
-              <w:rPr>
-                <w:rFonts w:ascii="Tahoma" w:hAnsi="Tahoma" w:cs="Tahoma"/>
-                <w:sz w:val="20"/>
-                <w:szCs w:val="20"/>
-              </w:rPr>
-              <w:t>feature</w:t>
-            </w:r>
-            <w:proofErr w:type="spellEnd"/>
-            <w:r>
-              <w:rPr>
-                <w:rFonts w:ascii="Tahoma" w:hAnsi="Tahoma" w:cs="Tahoma"/>
-                <w:sz w:val="20"/>
-                <w:szCs w:val="20"/>
-              </w:rPr>
-              <w:t xml:space="preserve">/RQ-### desde </w:t>
-            </w:r>
-            <w:proofErr w:type="spellStart"/>
-            <w:r>
-              <w:rPr>
-                <w:rFonts w:ascii="Tahoma" w:hAnsi="Tahoma" w:cs="Tahoma"/>
-                <w:sz w:val="20"/>
-                <w:szCs w:val="20"/>
-              </w:rPr>
-              <w:t>develop</w:t>
-            </w:r>
-            <w:proofErr w:type="spellEnd"/>
-          </w:p>
-          <w:p>
-            <w:pPr>
-              <w:pStyle w:val="ListParagraph"/>
+            <w:r>
+              <w:rPr>
+                <w:rFonts w:ascii="Tahoma" w:hAnsi="Tahoma" w:cs="Tahoma"/>
+                <w:sz w:val="20"/>
+                <w:szCs w:val="20"/>
+              </w:rPr>
+              <w:t>feature/&lt;cuenta_control&gt;-&lt;nombre_paquete&gt;</w:t>
+            </w:r>
+            <w:r>
+              <w:rPr>
+                <w:rFonts w:ascii="Tahoma" w:hAnsi="Tahoma" w:cs="Tahoma"/>
+                <w:sz w:val="20"/>
+                <w:szCs w:val="20"/>
+              </w:rPr>
+              <w:t xml:space="preserve"> desde develop</w:t>
+            </w:r>
+          </w:p>
+          <w:p>
+            <w:pPr>
+              <w:pStyle w:val="Prrafodelista"/>
               <w:numPr>
                 <w:ilvl w:val="0"/>
                 <w:numId w:val="17"/>
@@ -3891,25 +3739,7 @@
                 <w:sz w:val="20"/>
                 <w:szCs w:val="20"/>
               </w:rPr>
-              <w:t xml:space="preserve">Desarrollo y </w:t>
-            </w:r>
-            <w:proofErr w:type="spellStart"/>
-            <w:r>
-              <w:rPr>
-                <w:rFonts w:ascii="Tahoma" w:hAnsi="Tahoma" w:cs="Tahoma"/>
-                <w:sz w:val="20"/>
-                <w:szCs w:val="20"/>
-              </w:rPr>
-              <w:t>testing</w:t>
-            </w:r>
-            <w:proofErr w:type="spellEnd"/>
-            <w:r>
-              <w:rPr>
-                <w:rFonts w:ascii="Tahoma" w:hAnsi="Tahoma" w:cs="Tahoma"/>
-                <w:sz w:val="20"/>
-                <w:szCs w:val="20"/>
-              </w:rPr>
-              <w:t xml:space="preserve"> completado</w:t>
+              <w:t>Desarrollo y testing completado</w:t>
             </w:r>
             <w:r>
               <w:rPr>
@@ -3919,56 +3749,18 @@
               </w:rPr>
               <w:t xml:space="preserve">: </w:t>
             </w:r>
-            <w:proofErr w:type="spellStart"/>
-            <w:r>
-              <w:rPr>
-                <w:rFonts w:ascii="Tahoma" w:hAnsi="Tahoma" w:cs="Tahoma"/>
-                <w:sz w:val="20"/>
-                <w:szCs w:val="20"/>
-              </w:rPr>
-              <w:t>Merge</w:t>
-            </w:r>
-            <w:proofErr w:type="spellEnd"/>
-            <w:r>
-              <w:rPr>
-                <w:rFonts w:ascii="Tahoma" w:hAnsi="Tahoma" w:cs="Tahoma"/>
-                <w:sz w:val="20"/>
-                <w:szCs w:val="20"/>
-              </w:rPr>
-              <w:t xml:space="preserve"> a </w:t>
-            </w:r>
-            <w:proofErr w:type="spellStart"/>
-            <w:r>
-              <w:rPr>
-                <w:rFonts w:ascii="Tahoma" w:hAnsi="Tahoma" w:cs="Tahoma"/>
-                <w:sz w:val="20"/>
-                <w:szCs w:val="20"/>
-              </w:rPr>
-              <w:t>develop</w:t>
-            </w:r>
-            <w:proofErr w:type="spellEnd"/>
-            <w:r>
-              <w:rPr>
-                <w:rFonts w:ascii="Tahoma" w:hAnsi="Tahoma" w:cs="Tahoma"/>
-                <w:sz w:val="20"/>
-                <w:szCs w:val="20"/>
-              </w:rPr>
-              <w:t xml:space="preserve"> vía Pull </w:t>
-            </w:r>
-            <w:proofErr w:type="spellStart"/>
-            <w:r>
-              <w:rPr>
-                <w:rFonts w:ascii="Tahoma" w:hAnsi="Tahoma" w:cs="Tahoma"/>
-                <w:sz w:val="20"/>
-                <w:szCs w:val="20"/>
-              </w:rPr>
-              <w:t>Request</w:t>
-            </w:r>
-            <w:proofErr w:type="spellEnd"/>
-          </w:p>
-          <w:p>
-            <w:pPr>
-              <w:pStyle w:val="ListParagraph"/>
+            <w:r>
+              <w:rPr>
+                <w:rFonts w:ascii="Tahoma" w:hAnsi="Tahoma" w:cs="Tahoma"/>
+                <w:sz w:val="20"/>
+                <w:szCs w:val="20"/>
+              </w:rPr>
+              <w:t>Merge a develop vía Pull Request</w:t>
+            </w:r>
+          </w:p>
+          <w:p>
+            <w:pPr>
+              <w:pStyle w:val="Prrafodelista"/>
               <w:numPr>
                 <w:ilvl w:val="0"/>
                 <w:numId w:val="17"/>
@@ -3995,9 +3787,8 @@
                 <w:szCs w:val="20"/>
                 <w:lang w:val="en-US"/>
               </w:rPr>
-              <w:t xml:space="preserve">Sprint </w:t>
-            </w:r>
-            <w:proofErr w:type="spellStart"/>
+              <w:t>Sprint completado</w:t>
+            </w:r>
             <w:r>
               <w:rPr>
                 <w:rFonts w:ascii="Tahoma" w:hAnsi="Tahoma" w:cs="Tahoma"/>
@@ -4005,9 +3796,8 @@
                 <w:szCs w:val="20"/>
                 <w:lang w:val="en-US"/>
               </w:rPr>
-              <w:t>completado</w:t>
-            </w:r>
-            <w:proofErr w:type="spellEnd"/>
+              <w:t xml:space="preserve">: </w:t>
+            </w:r>
             <w:r>
               <w:rPr>
                 <w:rFonts w:ascii="Tahoma" w:hAnsi="Tahoma" w:cs="Tahoma"/>
@@ -4015,21 +3805,12 @@
                 <w:szCs w:val="20"/>
                 <w:lang w:val="en-US"/>
               </w:rPr>
-              <w:t xml:space="preserve">: </w:t>
-            </w:r>
-            <w:r>
-              <w:rPr>
-                <w:rFonts w:ascii="Tahoma" w:hAnsi="Tahoma" w:cs="Tahoma"/>
-                <w:sz w:val="20"/>
-                <w:szCs w:val="20"/>
-                <w:lang w:val="en-US"/>
-              </w:rPr>
               <w:t>Merge a main para release</w:t>
             </w:r>
           </w:p>
           <w:p>
             <w:pPr>
-              <w:pStyle w:val="ListParagraph"/>
+              <w:pStyle w:val="Prrafodelista"/>
               <w:numPr>
                 <w:ilvl w:val="0"/>
                 <w:numId w:val="17"/>
@@ -4068,18 +3849,8 @@
                 <w:sz w:val="20"/>
                 <w:szCs w:val="20"/>
               </w:rPr>
-              <w:t xml:space="preserve">Actualizada en rama </w:t>
-            </w:r>
-            <w:proofErr w:type="spellStart"/>
-            <w:r>
-              <w:rPr>
-                <w:rFonts w:ascii="Tahoma" w:hAnsi="Tahoma" w:cs="Tahoma"/>
-                <w:sz w:val="20"/>
-                <w:szCs w:val="20"/>
-              </w:rPr>
-              <w:t>doc</w:t>
-            </w:r>
-            <w:proofErr w:type="spellEnd"/>
+              <w:t>Actualizada en rama doc</w:t>
+            </w:r>
           </w:p>
         </w:tc>
       </w:tr>
@@ -4162,7 +3933,7 @@
         </w:tcPr>
         <w:p>
           <w:pPr>
-            <w:pStyle w:val="Header"/>
+            <w:pStyle w:val="Encabezado"/>
             <w:rPr>
               <w:caps/>
               <w:sz w:val="18"/>
@@ -4181,7 +3952,7 @@
         </w:tcPr>
         <w:p>
           <w:pPr>
-            <w:pStyle w:val="Header"/>
+            <w:pStyle w:val="Encabezado"/>
             <w:jc w:val="right"/>
             <w:rPr>
               <w:caps/>
@@ -4194,7 +3965,7 @@
   </w:tbl>
   <w:p>
     <w:pPr>
-      <w:pStyle w:val="Footer"/>
+      <w:pStyle w:val="Piedepgina"/>
       <w:jc w:val="right"/>
       <w:rPr>
         <w:rFonts w:ascii="Tahoma" w:hAnsi="Tahoma" w:cs="Tahoma"/>
@@ -4305,7 +4076,7 @@
 <w:hdr xmlns:wpc="http://schemas.microsoft.com/office/word/2010/wordprocessingCanvas" xmlns:cx="http://schemas.microsoft.com/office/drawing/2014/chartex" xmlns:cx1="http://schemas.microsoft.com/office/drawing/2015/9/8/chartex" xmlns:cx2="http://schemas.microsoft.com/office/drawing/2015/10/21/chartex" xmlns:cx3="http://schemas.microsoft.com/office/drawing/2016/5/9/chartex" xmlns:cx4="http://schemas.microsoft.com/office/drawing/2016/5/10/chartex" xmlns:cx5="http://schemas.microsoft.com/office/drawing/2016/5/11/chartex" xmlns:cx6="http://schemas.microsoft.com/office/drawing/2016/5/12/chartex" xmlns:cx7="http://schemas.microsoft.com/office/drawing/2016/5/13/chartex" xmlns:cx8="http://schemas.microsoft.com/office/drawing/2016/5/14/chartex" xmlns:mc="http://schemas.openxmlformats.org/markup-compatibility/2006" xmlns:aink="http://schemas.microsoft.com/office/drawing/2016/ink" xmlns:am3d="http://schemas.microsoft.com/office/drawing/2017/model3d" xmlns:o="urn:schemas-microsoft-com:office:office" xmlns:oel="http://schemas.microsoft.com/office/2019/extlst" xmlns:r="http://schemas.openxmlformats.org/officeDocument/2006/relationships" xmlns:m="http://schemas.openxmlformats.org/officeDocument/2006/math" xmlns:v="urn:schemas-microsoft-com:vml" xmlns:wp14="http://schemas.microsoft.com/office/word/2010/wordprocessingDrawing" xmlns:wp="http://schemas.openxmlformats.org/drawingml/2006/wordprocessingDrawing" xmlns:w10="urn:schemas-microsoft-com:office:word" xmlns:w="http://schemas.openxmlformats.org/wordprocessingml/2006/main" xmlns:w14="http://schemas.microsoft.com/office/word/2010/wordml" xmlns:w15="http://schemas.microsoft.com/office/word/2012/wordml" xmlns:w16cex="http://schemas.microsoft.com/office/word/2018/wordml/cex" xmlns:w16cid="http://schemas.microsoft.com/office/word/2016/wordml/cid" xmlns:w16="http://schemas.microsoft.com/office/word/2018/wordml" xmlns:w16du="http://schemas.microsoft.com/office/word/2023/wordml/word16du" xmlns:w16sdtdh="http://schemas.microsoft.com/office/word/2020/wordml/sdtdatahash" xmlns:w16sdtfl="http://schemas.microsoft.com/office/word/2024/wordml/sdtformatlock" xmlns:w16se="http://schemas.microsoft.com/office/word/2015/wordml/symex" xmlns:wpg="http://schemas.microsoft.com/office/word/2010/wordprocessingGroup" xmlns:wpi="http://schemas.microsoft.com/office/word/2010/wordprocessingInk" xmlns:wne="http://schemas.microsoft.com/office/word/2006/wordml" xmlns:wps="http://schemas.microsoft.com/office/word/2010/wordprocessingShape" mc:Ignorable="w14 w15 w16se w16cid w16 w16cex w16sdtdh w16sdtfl w16du wp14">
   <w:p>
     <w:pPr>
-      <w:pStyle w:val="Header"/>
+      <w:pStyle w:val="Encabezado"/>
       <w:spacing w:after="100"/>
     </w:pPr>
     <w:r>
@@ -4386,11 +4157,10 @@
                             <w:dataBinding w:prefixMappings="xmlns:ns0='http://purl.org/dc/elements/1.1/' xmlns:ns1='http://schemas.openxmlformats.org/package/2006/metadata/core-properties' " w:xpath="/ns1:coreProperties[1]/ns0:title[1]" w:storeItemID="{6C3C8BC8-F283-45AE-878A-BAB7291924A1}"/>
                             <w:text/>
                           </w:sdtPr>
-                          <w:sdtEndPr/>
                           <w:sdtContent>
                             <w:p>
                               <w:pPr>
-                                <w:pStyle w:val="Header"/>
+                                <w:pStyle w:val="Encabezado"/>
                                 <w:spacing w:afterAutospacing="0"/>
                                 <w:jc w:val="center"/>
                                 <w:rPr>
@@ -4435,7 +4205,7 @@
             </wp:anchor>
           </w:drawing>
         </mc:Choice>
-        <mc:Fallback xmlns:arto="http://schemas.microsoft.com/office/word/2006/arto">
+        <mc:Fallback>
           <w:pict>
             <v:rect w14:anchorId="25070CCC" id="Rectángulo 200" o:spid="_x0000_s1026" style="position:absolute;margin-left:0;margin-top:0;width:468.5pt;height:21.3pt;z-index:-251658240;visibility:visible;mso-wrap-style:square;mso-width-percent:1000;mso-height-percent:27;mso-top-percent:45;mso-wrap-distance-left:9.35pt;mso-wrap-distance-top:0;mso-wrap-distance-right:9.35pt;mso-wrap-distance-bottom:0;mso-position-horizontal:center;mso-position-horizontal-relative:margin;mso-position-vertical-relative:page;mso-width-percent:1000;mso-height-percent:27;mso-top-percent:45;mso-width-relative:margin;mso-height-relative:page;v-text-anchor:middle" o:gfxdata="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" o:allowoverlap="f" fillcolor="#156082 [3204]" stroked="f" strokeweight="1.5pt">
               <v:textbox style="mso-fit-shape-to-text:t">
@@ -4455,7 +4225,7 @@
                     <w:sdtContent>
                       <w:p>
                         <w:pPr>
-                          <w:pStyle w:val="Header"/>
+                          <w:pStyle w:val="Encabezado"/>
                           <w:spacing w:afterAutospacing="0"/>
                           <w:jc w:val="center"/>
                           <w:rPr>
@@ -7839,11 +7609,11 @@
       <w14:ligatures w14:val="none"/>
     </w:rPr>
   </w:style>
-  <w:style w:type="paragraph" w:styleId="Heading1">
+  <w:style w:type="paragraph" w:styleId="Ttulo1">
     <w:name w:val="heading 1"/>
     <w:basedOn w:val="Normal"/>
     <w:next w:val="Normal"/>
-    <w:link w:val="Heading1Char"/>
+    <w:link w:val="Ttulo1Car"/>
     <w:uiPriority w:val="9"/>
     <w:qFormat/>
     <w:rsid w:val="00F41087"/>
@@ -7863,11 +7633,11 @@
       <w14:ligatures w14:val="standardContextual"/>
     </w:rPr>
   </w:style>
-  <w:style w:type="paragraph" w:styleId="Heading2">
+  <w:style w:type="paragraph" w:styleId="Ttulo2">
     <w:name w:val="heading 2"/>
     <w:basedOn w:val="Normal"/>
     <w:next w:val="Normal"/>
-    <w:link w:val="Heading2Char"/>
+    <w:link w:val="Ttulo2Car"/>
     <w:uiPriority w:val="9"/>
     <w:semiHidden/>
     <w:unhideWhenUsed/>
@@ -7889,11 +7659,11 @@
       <w14:ligatures w14:val="standardContextual"/>
     </w:rPr>
   </w:style>
-  <w:style w:type="paragraph" w:styleId="Heading3">
+  <w:style w:type="paragraph" w:styleId="Ttulo3">
     <w:name w:val="heading 3"/>
     <w:basedOn w:val="Normal"/>
     <w:next w:val="Normal"/>
-    <w:link w:val="Heading3Char"/>
+    <w:link w:val="Ttulo3Car"/>
     <w:uiPriority w:val="9"/>
     <w:semiHidden/>
     <w:unhideWhenUsed/>
@@ -7915,11 +7685,11 @@
       <w14:ligatures w14:val="standardContextual"/>
     </w:rPr>
   </w:style>
-  <w:style w:type="paragraph" w:styleId="Heading4">
+  <w:style w:type="paragraph" w:styleId="Ttulo4">
     <w:name w:val="heading 4"/>
     <w:basedOn w:val="Normal"/>
     <w:next w:val="Normal"/>
-    <w:link w:val="Heading4Char"/>
+    <w:link w:val="Ttulo4Car"/>
     <w:uiPriority w:val="9"/>
     <w:semiHidden/>
     <w:unhideWhenUsed/>
@@ -7943,11 +7713,11 @@
       <w14:ligatures w14:val="standardContextual"/>
     </w:rPr>
   </w:style>
-  <w:style w:type="paragraph" w:styleId="Heading5">
+  <w:style w:type="paragraph" w:styleId="Ttulo5">
     <w:name w:val="heading 5"/>
     <w:basedOn w:val="Normal"/>
     <w:next w:val="Normal"/>
-    <w:link w:val="Heading5Char"/>
+    <w:link w:val="Ttulo5Car"/>
     <w:uiPriority w:val="9"/>
     <w:semiHidden/>
     <w:unhideWhenUsed/>
@@ -7969,11 +7739,11 @@
       <w14:ligatures w14:val="standardContextual"/>
     </w:rPr>
   </w:style>
-  <w:style w:type="paragraph" w:styleId="Heading6">
+  <w:style w:type="paragraph" w:styleId="Ttulo6">
     <w:name w:val="heading 6"/>
     <w:basedOn w:val="Normal"/>
     <w:next w:val="Normal"/>
-    <w:link w:val="Heading6Char"/>
+    <w:link w:val="Ttulo6Car"/>
     <w:uiPriority w:val="9"/>
     <w:semiHidden/>
     <w:unhideWhenUsed/>
@@ -7997,11 +7767,11 @@
       <w14:ligatures w14:val="standardContextual"/>
     </w:rPr>
   </w:style>
-  <w:style w:type="paragraph" w:styleId="Heading7">
+  <w:style w:type="paragraph" w:styleId="Ttulo7">
     <w:name w:val="heading 7"/>
     <w:basedOn w:val="Normal"/>
     <w:next w:val="Normal"/>
-    <w:link w:val="Heading7Char"/>
+    <w:link w:val="Ttulo7Car"/>
     <w:uiPriority w:val="9"/>
     <w:semiHidden/>
     <w:unhideWhenUsed/>
@@ -8023,11 +7793,11 @@
       <w14:ligatures w14:val="standardContextual"/>
     </w:rPr>
   </w:style>
-  <w:style w:type="paragraph" w:styleId="Heading8">
+  <w:style w:type="paragraph" w:styleId="Ttulo8">
     <w:name w:val="heading 8"/>
     <w:basedOn w:val="Normal"/>
     <w:next w:val="Normal"/>
-    <w:link w:val="Heading8Char"/>
+    <w:link w:val="Ttulo8Car"/>
     <w:uiPriority w:val="9"/>
     <w:semiHidden/>
     <w:unhideWhenUsed/>
@@ -8051,11 +7821,11 @@
       <w14:ligatures w14:val="standardContextual"/>
     </w:rPr>
   </w:style>
-  <w:style w:type="paragraph" w:styleId="Heading9">
+  <w:style w:type="paragraph" w:styleId="Ttulo9">
     <w:name w:val="heading 9"/>
     <w:basedOn w:val="Normal"/>
     <w:next w:val="Normal"/>
-    <w:link w:val="Heading9Char"/>
+    <w:link w:val="Ttulo9Car"/>
     <w:uiPriority w:val="9"/>
     <w:semiHidden/>
     <w:unhideWhenUsed/>
@@ -8077,13 +7847,13 @@
       <w14:ligatures w14:val="standardContextual"/>
     </w:rPr>
   </w:style>
-  <w:style w:type="character" w:default="1" w:styleId="DefaultParagraphFont">
+  <w:style w:type="character" w:default="1" w:styleId="Fuentedeprrafopredeter">
     <w:name w:val="Default Paragraph Font"/>
     <w:uiPriority w:val="1"/>
     <w:semiHidden/>
     <w:unhideWhenUsed/>
   </w:style>
-  <w:style w:type="table" w:default="1" w:styleId="TableNormal">
+  <w:style w:type="table" w:default="1" w:styleId="Tablanormal">
     <w:name w:val="Normal Table"/>
     <w:uiPriority w:val="99"/>
     <w:semiHidden/>
@@ -8098,16 +7868,16 @@
       </w:tblCellMar>
     </w:tblPr>
   </w:style>
-  <w:style w:type="numbering" w:default="1" w:styleId="NoList">
+  <w:style w:type="numbering" w:default="1" w:styleId="Sinlista">
     <w:name w:val="No List"/>
     <w:uiPriority w:val="99"/>
     <w:semiHidden/>
     <w:unhideWhenUsed/>
   </w:style>
-  <w:style w:type="character" w:customStyle="1" w:styleId="Heading1Char">
-    <w:name w:val="Heading 1 Char"/>
-    <w:basedOn w:val="DefaultParagraphFont"/>
-    <w:link w:val="Heading1"/>
+  <w:style w:type="character" w:customStyle="1" w:styleId="Ttulo1Car">
+    <w:name w:val="Título 1 Car"/>
+    <w:basedOn w:val="Fuentedeprrafopredeter"/>
+    <w:link w:val="Ttulo1"/>
     <w:uiPriority w:val="9"/>
     <w:rsid w:val="00F41087"/>
     <w:rPr>
@@ -8117,10 +7887,10 @@
       <w:szCs w:val="40"/>
     </w:rPr>
   </w:style>
-  <w:style w:type="character" w:customStyle="1" w:styleId="Heading2Char">
-    <w:name w:val="Heading 2 Char"/>
-    <w:basedOn w:val="DefaultParagraphFont"/>
-    <w:link w:val="Heading2"/>
+  <w:style w:type="character" w:customStyle="1" w:styleId="Ttulo2Car">
+    <w:name w:val="Título 2 Car"/>
+    <w:basedOn w:val="Fuentedeprrafopredeter"/>
+    <w:link w:val="Ttulo2"/>
     <w:uiPriority w:val="9"/>
     <w:semiHidden/>
     <w:rsid w:val="00F41087"/>
@@ -8131,10 +7901,10 @@
       <w:szCs w:val="32"/>
     </w:rPr>
   </w:style>
-  <w:style w:type="character" w:customStyle="1" w:styleId="Heading3Char">
-    <w:name w:val="Heading 3 Char"/>
-    <w:basedOn w:val="DefaultParagraphFont"/>
-    <w:link w:val="Heading3"/>
+  <w:style w:type="character" w:customStyle="1" w:styleId="Ttulo3Car">
+    <w:name w:val="Título 3 Car"/>
+    <w:basedOn w:val="Fuentedeprrafopredeter"/>
+    <w:link w:val="Ttulo3"/>
     <w:uiPriority w:val="9"/>
     <w:semiHidden/>
     <w:rsid w:val="00F41087"/>
@@ -8145,10 +7915,10 @@
       <w:szCs w:val="28"/>
     </w:rPr>
   </w:style>
-  <w:style w:type="character" w:customStyle="1" w:styleId="Heading4Char">
-    <w:name w:val="Heading 4 Char"/>
-    <w:basedOn w:val="DefaultParagraphFont"/>
-    <w:link w:val="Heading4"/>
+  <w:style w:type="character" w:customStyle="1" w:styleId="Ttulo4Car">
+    <w:name w:val="Título 4 Car"/>
+    <w:basedOn w:val="Fuentedeprrafopredeter"/>
+    <w:link w:val="Ttulo4"/>
     <w:uiPriority w:val="9"/>
     <w:semiHidden/>
     <w:rsid w:val="00F41087"/>
@@ -8159,10 +7929,10 @@
       <w:color w:val="0F4761" w:themeColor="accent1" w:themeShade="BF"/>
     </w:rPr>
   </w:style>
-  <w:style w:type="character" w:customStyle="1" w:styleId="Heading5Char">
-    <w:name w:val="Heading 5 Char"/>
-    <w:basedOn w:val="DefaultParagraphFont"/>
-    <w:link w:val="Heading5"/>
+  <w:style w:type="character" w:customStyle="1" w:styleId="Ttulo5Car">
+    <w:name w:val="Título 5 Car"/>
+    <w:basedOn w:val="Fuentedeprrafopredeter"/>
+    <w:link w:val="Ttulo5"/>
     <w:uiPriority w:val="9"/>
     <w:semiHidden/>
     <w:rsid w:val="00F41087"/>
@@ -8171,10 +7941,10 @@
       <w:color w:val="0F4761" w:themeColor="accent1" w:themeShade="BF"/>
     </w:rPr>
   </w:style>
-  <w:style w:type="character" w:customStyle="1" w:styleId="Heading6Char">
-    <w:name w:val="Heading 6 Char"/>
-    <w:basedOn w:val="DefaultParagraphFont"/>
-    <w:link w:val="Heading6"/>
+  <w:style w:type="character" w:customStyle="1" w:styleId="Ttulo6Car">
+    <w:name w:val="Título 6 Car"/>
+    <w:basedOn w:val="Fuentedeprrafopredeter"/>
+    <w:link w:val="Ttulo6"/>
     <w:uiPriority w:val="9"/>
     <w:semiHidden/>
     <w:rsid w:val="00F41087"/>
@@ -8185,10 +7955,10 @@
       <w:color w:val="595959" w:themeColor="text1" w:themeTint="A6"/>
     </w:rPr>
   </w:style>
-  <w:style w:type="character" w:customStyle="1" w:styleId="Heading7Char">
-    <w:name w:val="Heading 7 Char"/>
-    <w:basedOn w:val="DefaultParagraphFont"/>
-    <w:link w:val="Heading7"/>
+  <w:style w:type="character" w:customStyle="1" w:styleId="Ttulo7Car">
+    <w:name w:val="Título 7 Car"/>
+    <w:basedOn w:val="Fuentedeprrafopredeter"/>
+    <w:link w:val="Ttulo7"/>
     <w:uiPriority w:val="9"/>
     <w:semiHidden/>
     <w:rsid w:val="00F41087"/>
@@ -8197,10 +7967,10 @@
       <w:color w:val="595959" w:themeColor="text1" w:themeTint="A6"/>
     </w:rPr>
   </w:style>
-  <w:style w:type="character" w:customStyle="1" w:styleId="Heading8Char">
-    <w:name w:val="Heading 8 Char"/>
-    <w:basedOn w:val="DefaultParagraphFont"/>
-    <w:link w:val="Heading8"/>
+  <w:style w:type="character" w:customStyle="1" w:styleId="Ttulo8Car">
+    <w:name w:val="Título 8 Car"/>
+    <w:basedOn w:val="Fuentedeprrafopredeter"/>
+    <w:link w:val="Ttulo8"/>
     <w:uiPriority w:val="9"/>
     <w:semiHidden/>
     <w:rsid w:val="00F41087"/>
@@ -8211,10 +7981,10 @@
       <w:color w:val="272727" w:themeColor="text1" w:themeTint="D8"/>
     </w:rPr>
   </w:style>
-  <w:style w:type="character" w:customStyle="1" w:styleId="Heading9Char">
-    <w:name w:val="Heading 9 Char"/>
-    <w:basedOn w:val="DefaultParagraphFont"/>
-    <w:link w:val="Heading9"/>
+  <w:style w:type="character" w:customStyle="1" w:styleId="Ttulo9Car">
+    <w:name w:val="Título 9 Car"/>
+    <w:basedOn w:val="Fuentedeprrafopredeter"/>
+    <w:link w:val="Ttulo9"/>
     <w:uiPriority w:val="9"/>
     <w:semiHidden/>
     <w:rsid w:val="00F41087"/>
@@ -8223,11 +7993,11 @@
       <w:color w:val="272727" w:themeColor="text1" w:themeTint="D8"/>
     </w:rPr>
   </w:style>
-  <w:style w:type="paragraph" w:styleId="Title">
+  <w:style w:type="paragraph" w:styleId="Ttulo">
     <w:name w:val="Title"/>
     <w:basedOn w:val="Normal"/>
     <w:next w:val="Normal"/>
-    <w:link w:val="TitleChar"/>
+    <w:link w:val="TtuloCar"/>
     <w:uiPriority w:val="10"/>
     <w:qFormat/>
     <w:rsid w:val="00F41087"/>
@@ -8245,10 +8015,10 @@
       <w14:ligatures w14:val="standardContextual"/>
     </w:rPr>
   </w:style>
-  <w:style w:type="character" w:customStyle="1" w:styleId="TitleChar">
-    <w:name w:val="Title Char"/>
-    <w:basedOn w:val="DefaultParagraphFont"/>
-    <w:link w:val="Title"/>
+  <w:style w:type="character" w:customStyle="1" w:styleId="TtuloCar">
+    <w:name w:val="Título Car"/>
+    <w:basedOn w:val="Fuentedeprrafopredeter"/>
+    <w:link w:val="Ttulo"/>
     <w:uiPriority w:val="10"/>
     <w:rsid w:val="00F41087"/>
     <w:rPr>
@@ -8259,11 +8029,11 @@
       <w:szCs w:val="56"/>
     </w:rPr>
   </w:style>
-  <w:style w:type="paragraph" w:styleId="Subtitle">
+  <w:style w:type="paragraph" w:styleId="Subttulo">
     <w:name w:val="Subtitle"/>
     <w:basedOn w:val="Normal"/>
     <w:next w:val="Normal"/>
-    <w:link w:val="SubtitleChar"/>
+    <w:link w:val="SubttuloCar"/>
     <w:uiPriority w:val="11"/>
     <w:qFormat/>
     <w:rsid w:val="00F41087"/>
@@ -8284,10 +8054,10 @@
       <w14:ligatures w14:val="standardContextual"/>
     </w:rPr>
   </w:style>
-  <w:style w:type="character" w:customStyle="1" w:styleId="SubtitleChar">
-    <w:name w:val="Subtitle Char"/>
-    <w:basedOn w:val="DefaultParagraphFont"/>
-    <w:link w:val="Subtitle"/>
+  <w:style w:type="character" w:customStyle="1" w:styleId="SubttuloCar">
+    <w:name w:val="Subtítulo Car"/>
+    <w:basedOn w:val="Fuentedeprrafopredeter"/>
+    <w:link w:val="Subttulo"/>
     <w:uiPriority w:val="11"/>
     <w:rsid w:val="00F41087"/>
     <w:rPr>
@@ -8298,11 +8068,11 @@
       <w:szCs w:val="28"/>
     </w:rPr>
   </w:style>
-  <w:style w:type="paragraph" w:styleId="Quote">
+  <w:style w:type="paragraph" w:styleId="Cita">
     <w:name w:val="Quote"/>
     <w:basedOn w:val="Normal"/>
     <w:next w:val="Normal"/>
-    <w:link w:val="QuoteChar"/>
+    <w:link w:val="CitaCar"/>
     <w:uiPriority w:val="29"/>
     <w:qFormat/>
     <w:rsid w:val="00F41087"/>
@@ -8321,10 +8091,10 @@
       <w14:ligatures w14:val="standardContextual"/>
     </w:rPr>
   </w:style>
-  <w:style w:type="character" w:customStyle="1" w:styleId="QuoteChar">
-    <w:name w:val="Quote Char"/>
-    <w:basedOn w:val="DefaultParagraphFont"/>
-    <w:link w:val="Quote"/>
+  <w:style w:type="character" w:customStyle="1" w:styleId="CitaCar">
+    <w:name w:val="Cita Car"/>
+    <w:basedOn w:val="Fuentedeprrafopredeter"/>
+    <w:link w:val="Cita"/>
     <w:uiPriority w:val="29"/>
     <w:rsid w:val="00F41087"/>
     <w:rPr>
@@ -8333,7 +8103,7 @@
       <w:color w:val="404040" w:themeColor="text1" w:themeTint="BF"/>
     </w:rPr>
   </w:style>
-  <w:style w:type="paragraph" w:styleId="ListParagraph">
+  <w:style w:type="paragraph" w:styleId="Prrafodelista">
     <w:name w:val="List Paragraph"/>
     <w:basedOn w:val="Normal"/>
     <w:uiPriority w:val="34"/>
@@ -8352,9 +8122,9 @@
       <w14:ligatures w14:val="standardContextual"/>
     </w:rPr>
   </w:style>
-  <w:style w:type="character" w:styleId="IntenseEmphasis">
+  <w:style w:type="character" w:styleId="nfasisintenso">
     <w:name w:val="Intense Emphasis"/>
-    <w:basedOn w:val="DefaultParagraphFont"/>
+    <w:basedOn w:val="Fuentedeprrafopredeter"/>
     <w:uiPriority w:val="21"/>
     <w:qFormat/>
     <w:rsid w:val="00F41087"/>
@@ -8364,11 +8134,11 @@
       <w:color w:val="0F4761" w:themeColor="accent1" w:themeShade="BF"/>
     </w:rPr>
   </w:style>
-  <w:style w:type="paragraph" w:styleId="IntenseQuote">
+  <w:style w:type="paragraph" w:styleId="Citadestacada">
     <w:name w:val="Intense Quote"/>
     <w:basedOn w:val="Normal"/>
     <w:next w:val="Normal"/>
-    <w:link w:val="IntenseQuoteChar"/>
+    <w:link w:val="CitadestacadaCar"/>
     <w:uiPriority w:val="30"/>
     <w:qFormat/>
     <w:rsid w:val="00F41087"/>
@@ -8392,10 +8162,10 @@
       <w14:ligatures w14:val="standardContextual"/>
     </w:rPr>
   </w:style>
-  <w:style w:type="character" w:customStyle="1" w:styleId="IntenseQuoteChar">
-    <w:name w:val="Intense Quote Char"/>
-    <w:basedOn w:val="DefaultParagraphFont"/>
-    <w:link w:val="IntenseQuote"/>
+  <w:style w:type="character" w:customStyle="1" w:styleId="CitadestacadaCar">
+    <w:name w:val="Cita destacada Car"/>
+    <w:basedOn w:val="Fuentedeprrafopredeter"/>
+    <w:link w:val="Citadestacada"/>
     <w:uiPriority w:val="30"/>
     <w:rsid w:val="00F41087"/>
     <w:rPr>
@@ -8404,9 +8174,9 @@
       <w:color w:val="0F4761" w:themeColor="accent1" w:themeShade="BF"/>
     </w:rPr>
   </w:style>
-  <w:style w:type="character" w:styleId="IntenseReference">
+  <w:style w:type="character" w:styleId="Referenciaintensa">
     <w:name w:val="Intense Reference"/>
-    <w:basedOn w:val="DefaultParagraphFont"/>
+    <w:basedOn w:val="Fuentedeprrafopredeter"/>
     <w:uiPriority w:val="32"/>
     <w:qFormat/>
     <w:rsid w:val="00F41087"/>
@@ -8418,9 +8188,9 @@
       <w:spacing w:val="5"/>
     </w:rPr>
   </w:style>
-  <w:style w:type="table" w:styleId="TableGrid">
+  <w:style w:type="table" w:styleId="Tablaconcuadrcula">
     <w:name w:val="Table Grid"/>
-    <w:basedOn w:val="TableNormal"/>
+    <w:basedOn w:val="Tablanormal"/>
     <w:uiPriority w:val="59"/>
     <w:rsid w:val="00F41087"/>
     <w:pPr>
@@ -8444,10 +8214,10 @@
       </w:tblBorders>
     </w:tblPr>
   </w:style>
-  <w:style w:type="paragraph" w:styleId="Header">
+  <w:style w:type="paragraph" w:styleId="Encabezado">
     <w:name w:val="header"/>
     <w:basedOn w:val="Normal"/>
-    <w:link w:val="HeaderChar"/>
+    <w:link w:val="EncabezadoCar"/>
     <w:uiPriority w:val="99"/>
     <w:unhideWhenUsed/>
     <w:rsid w:val="00F41087"/>
@@ -8459,10 +8229,10 @@
       <w:spacing w:after="0" w:line="240" w:lineRule="auto"/>
     </w:pPr>
   </w:style>
-  <w:style w:type="character" w:customStyle="1" w:styleId="HeaderChar">
-    <w:name w:val="Header Char"/>
-    <w:basedOn w:val="DefaultParagraphFont"/>
-    <w:link w:val="Header"/>
+  <w:style w:type="character" w:customStyle="1" w:styleId="EncabezadoCar">
+    <w:name w:val="Encabezado Car"/>
+    <w:basedOn w:val="Fuentedeprrafopredeter"/>
+    <w:link w:val="Encabezado"/>
     <w:uiPriority w:val="99"/>
     <w:rsid w:val="00F41087"/>
     <w:rPr>
@@ -8473,10 +8243,10 @@
       <w14:ligatures w14:val="none"/>
     </w:rPr>
   </w:style>
-  <w:style w:type="paragraph" w:styleId="Footer">
+  <w:style w:type="paragraph" w:styleId="Piedepgina">
     <w:name w:val="footer"/>
     <w:basedOn w:val="Normal"/>
-    <w:link w:val="FooterChar"/>
+    <w:link w:val="PiedepginaCar"/>
     <w:uiPriority w:val="99"/>
     <w:unhideWhenUsed/>
     <w:rsid w:val="00F41087"/>
@@ -8488,10 +8258,10 @@
       <w:spacing w:after="0" w:line="240" w:lineRule="auto"/>
     </w:pPr>
   </w:style>
-  <w:style w:type="character" w:customStyle="1" w:styleId="FooterChar">
-    <w:name w:val="Footer Char"/>
-    <w:basedOn w:val="DefaultParagraphFont"/>
-    <w:link w:val="Footer"/>
+  <w:style w:type="character" w:customStyle="1" w:styleId="PiedepginaCar">
+    <w:name w:val="Pie de página Car"/>
+    <w:basedOn w:val="Fuentedeprrafopredeter"/>
+    <w:link w:val="Piedepgina"/>
     <w:uiPriority w:val="99"/>
     <w:rsid w:val="00F41087"/>
     <w:rPr>
@@ -8502,7 +8272,7 @@
       <w14:ligatures w14:val="none"/>
     </w:rPr>
   </w:style>
-  <w:style w:type="character" w:styleId="Strong">
+  <w:style w:type="character" w:styleId="Fuerte">
     <w:name w:val="Strong"/>
     <w:uiPriority w:val="22"/>
     <w:qFormat/>

</xml_diff>